<commit_message>
docs(sprint-8): agregar validaciones humanas de PBL-17 y PBL-19
</commit_message>
<xml_diff>
--- a/docs/sprints/sprint-8/01_Entrega_Jesus_Sprint_8.docx
+++ b/docs/sprints/sprint-8/01_Entrega_Jesus_Sprint_8.docx
@@ -678,8 +678,889 @@
       </w:r>
     </w:p>
     <w:p/>
+    <w:p>
+      <w:r>
+        <w:br w:type="page"/>
+      </w:r>
+    </w:p>
+    <w:p>
+      <w:pPr>
+        <w:pStyle w:val="Ttulo1"/>
+      </w:pPr>
+      <w:r>
+        <w:lastRenderedPageBreak/>
+        <w:t>Validaciones humanas para el cierre</w:t>
+      </w:r>
+    </w:p>
+    <w:p>
+      <w:r>
+        <w:t>Las historias PBL-17 y PBL-19 permanecerán En curso hasta completar las siguientes validaciones con personas reales. No se deben inventar nombres, fechas ni resultados.</w:t>
+      </w:r>
+    </w:p>
+    <w:p>
+      <w:pPr>
+        <w:pStyle w:val="Ttulo2"/>
+      </w:pPr>
+      <w:r>
+        <w:t>Prueba de uso de PBL 17</w:t>
+      </w:r>
+    </w:p>
+    <w:p>
+      <w:r>
+        <w:t>Una persona ajena al desarrollo debe localizar Inicio, Nota médica, Copias de seguridad, Análisis de datos, Actividad diaria y Patrones en los datos sin recibir una explicación previa.</w:t>
+      </w:r>
+    </w:p>
+    <w:tbl>
+      <w:tblPr>
+        <w:tblW w:w="0" w:type="auto"/>
+        <w:jc w:val="center"/>
+        <w:tblBorders>
+          <w:top w:val="single" w:sz="6" w:space="0" w:color="D9D9D9"/>
+          <w:left w:val="single" w:sz="6" w:space="0" w:color="D9D9D9"/>
+          <w:bottom w:val="single" w:sz="6" w:space="0" w:color="D9D9D9"/>
+          <w:right w:val="single" w:sz="6" w:space="0" w:color="D9D9D9"/>
+          <w:insideH w:val="single" w:sz="6" w:space="0" w:color="D9D9D9"/>
+          <w:insideV w:val="single" w:sz="6" w:space="0" w:color="D9D9D9"/>
+        </w:tblBorders>
+        <w:tblLayout w:type="fixed"/>
+        <w:tblLook w:val="04A0" w:firstRow="1" w:lastRow="0" w:firstColumn="1" w:lastColumn="0" w:noHBand="0" w:noVBand="1"/>
+      </w:tblPr>
+      <w:tblGrid>
+        <w:gridCol w:w="3168"/>
+        <w:gridCol w:w="5904"/>
+      </w:tblGrid>
+      <w:tr>
+        <w:trPr>
+          <w:jc w:val="center"/>
+        </w:trPr>
+        <w:tc>
+          <w:tcPr>
+            <w:tcW w:w="3168" w:type="dxa"/>
+            <w:shd w:val="clear" w:color="auto" w:fill="1F4E78"/>
+            <w:vAlign w:val="center"/>
+          </w:tcPr>
+          <w:p>
+            <w:r>
+              <w:rPr>
+                <w:b/>
+                <w:color w:val="FFFFFF"/>
+                <w:sz w:val="18"/>
+              </w:rPr>
+              <w:t>Dato</w:t>
+            </w:r>
+          </w:p>
+        </w:tc>
+        <w:tc>
+          <w:tcPr>
+            <w:tcW w:w="5904" w:type="dxa"/>
+            <w:shd w:val="clear" w:color="auto" w:fill="1F4E78"/>
+            <w:vAlign w:val="center"/>
+          </w:tcPr>
+          <w:p>
+            <w:r>
+              <w:rPr>
+                <w:b/>
+                <w:color w:val="FFFFFF"/>
+                <w:sz w:val="18"/>
+              </w:rPr>
+              <w:t>Información que debes completar</w:t>
+            </w:r>
+          </w:p>
+        </w:tc>
+      </w:tr>
+      <w:tr>
+        <w:trPr>
+          <w:jc w:val="center"/>
+        </w:trPr>
+        <w:tc>
+          <w:tcPr>
+            <w:tcW w:w="3168" w:type="dxa"/>
+            <w:vAlign w:val="center"/>
+          </w:tcPr>
+          <w:p>
+            <w:pPr>
+              <w:spacing w:after="40"/>
+            </w:pPr>
+            <w:r>
+              <w:rPr>
+                <w:sz w:val="18"/>
+              </w:rPr>
+              <w:t>Nombre del participante</w:t>
+            </w:r>
+          </w:p>
+        </w:tc>
+        <w:tc>
+          <w:tcPr>
+            <w:tcW w:w="5904" w:type="dxa"/>
+            <w:vAlign w:val="center"/>
+          </w:tcPr>
+          <w:p>
+            <w:pPr>
+              <w:spacing w:after="40"/>
+            </w:pPr>
+            <w:r>
+              <w:rPr>
+                <w:sz w:val="18"/>
+              </w:rPr>
+              <w:t>Raquel</w:t>
+            </w:r>
+          </w:p>
+        </w:tc>
+      </w:tr>
+      <w:tr>
+        <w:trPr>
+          <w:jc w:val="center"/>
+        </w:trPr>
+        <w:tc>
+          <w:tcPr>
+            <w:tcW w:w="3168" w:type="dxa"/>
+            <w:shd w:val="clear" w:color="auto" w:fill="EAF2F8"/>
+            <w:vAlign w:val="center"/>
+          </w:tcPr>
+          <w:p>
+            <w:pPr>
+              <w:spacing w:after="40"/>
+            </w:pPr>
+            <w:r>
+              <w:rPr>
+                <w:sz w:val="18"/>
+              </w:rPr>
+              <w:t>Fecha de la prueba</w:t>
+            </w:r>
+          </w:p>
+        </w:tc>
+        <w:tc>
+          <w:tcPr>
+            <w:tcW w:w="5904" w:type="dxa"/>
+            <w:shd w:val="clear" w:color="auto" w:fill="EAF2F8"/>
+            <w:vAlign w:val="center"/>
+          </w:tcPr>
+          <w:p>
+            <w:pPr>
+              <w:spacing w:after="40"/>
+            </w:pPr>
+            <w:r>
+              <w:rPr>
+                <w:sz w:val="18"/>
+              </w:rPr>
+              <w:t>07/10/2026</w:t>
+            </w:r>
+          </w:p>
+        </w:tc>
+      </w:tr>
+      <w:tr>
+        <w:trPr>
+          <w:jc w:val="center"/>
+        </w:trPr>
+        <w:tc>
+          <w:tcPr>
+            <w:tcW w:w="3168" w:type="dxa"/>
+            <w:vAlign w:val="center"/>
+          </w:tcPr>
+          <w:p>
+            <w:pPr>
+              <w:spacing w:after="40"/>
+            </w:pPr>
+            <w:r>
+              <w:rPr>
+                <w:sz w:val="18"/>
+              </w:rPr>
+              <w:t>Resultado</w:t>
+            </w:r>
+          </w:p>
+        </w:tc>
+        <w:tc>
+          <w:tcPr>
+            <w:tcW w:w="5904" w:type="dxa"/>
+            <w:vAlign w:val="center"/>
+          </w:tcPr>
+          <w:p>
+            <w:pPr>
+              <w:spacing w:after="40"/>
+            </w:pPr>
+            <w:r>
+              <w:rPr>
+                <w:sz w:val="18"/>
+              </w:rPr>
+              <w:t xml:space="preserve"> Aprobado </w:t>
+            </w:r>
+          </w:p>
+        </w:tc>
+      </w:tr>
+      <w:tr>
+        <w:trPr>
+          <w:jc w:val="center"/>
+        </w:trPr>
+        <w:tc>
+          <w:tcPr>
+            <w:tcW w:w="3168" w:type="dxa"/>
+            <w:shd w:val="clear" w:color="auto" w:fill="EAF2F8"/>
+            <w:vAlign w:val="center"/>
+          </w:tcPr>
+          <w:p>
+            <w:pPr>
+              <w:spacing w:after="40"/>
+            </w:pPr>
+            <w:r>
+              <w:rPr>
+                <w:sz w:val="18"/>
+              </w:rPr>
+              <w:t>Problemas encontrados</w:t>
+            </w:r>
+          </w:p>
+        </w:tc>
+        <w:tc>
+          <w:tcPr>
+            <w:tcW w:w="5904" w:type="dxa"/>
+            <w:shd w:val="clear" w:color="auto" w:fill="EAF2F8"/>
+            <w:vAlign w:val="center"/>
+          </w:tcPr>
+          <w:p>
+            <w:pPr>
+              <w:spacing w:after="40"/>
+            </w:pPr>
+            <w:proofErr w:type="spellStart"/>
+            <w:r>
+              <w:rPr>
+                <w:sz w:val="18"/>
+                <w:szCs w:val="18"/>
+              </w:rPr>
+              <w:t>Ninguna</w:t>
+            </w:r>
+            <w:proofErr w:type="spellEnd"/>
+          </w:p>
+        </w:tc>
+      </w:tr>
+      <w:tr>
+        <w:trPr>
+          <w:jc w:val="center"/>
+        </w:trPr>
+        <w:tc>
+          <w:tcPr>
+            <w:tcW w:w="3168" w:type="dxa"/>
+            <w:vAlign w:val="center"/>
+          </w:tcPr>
+          <w:p>
+            <w:pPr>
+              <w:spacing w:after="40"/>
+            </w:pPr>
+            <w:r>
+              <w:rPr>
+                <w:sz w:val="18"/>
+              </w:rPr>
+              <w:t>Observaciones</w:t>
+            </w:r>
+          </w:p>
+        </w:tc>
+        <w:tc>
+          <w:tcPr>
+            <w:tcW w:w="5904" w:type="dxa"/>
+            <w:vAlign w:val="center"/>
+          </w:tcPr>
+          <w:p>
+            <w:pPr>
+              <w:spacing w:after="40"/>
+            </w:pPr>
+            <w:proofErr w:type="spellStart"/>
+            <w:r>
+              <w:rPr>
+                <w:sz w:val="18"/>
+              </w:rPr>
+              <w:t>Ninguna</w:t>
+            </w:r>
+            <w:proofErr w:type="spellEnd"/>
+            <w:r>
+              <w:rPr>
+                <w:sz w:val="18"/>
+              </w:rPr>
+              <w:t xml:space="preserve"> </w:t>
+            </w:r>
+            <w:proofErr w:type="spellStart"/>
+            <w:r>
+              <w:rPr>
+                <w:sz w:val="18"/>
+              </w:rPr>
+              <w:t>observacion</w:t>
+            </w:r>
+            <w:proofErr w:type="spellEnd"/>
+          </w:p>
+        </w:tc>
+      </w:tr>
+    </w:tbl>
+    <w:p/>
+    <w:p>
+      <w:pPr>
+        <w:jc w:val="center"/>
+        <w:rPr>
+          <w:i/>
+          <w:sz w:val="18"/>
+        </w:rPr>
+      </w:pPr>
+      <w:r>
+        <w:rPr>
+          <w:i/>
+          <w:sz w:val="18"/>
+        </w:rPr>
+        <w:drawing>
+          <wp:inline distT="0" distB="0" distL="0" distR="0" wp14:anchorId="30D18DB9" wp14:editId="2A7D68D5">
+            <wp:extent cx="6309360" cy="2880995"/>
+            <wp:effectExtent l="0" t="0" r="0" b="0"/>
+            <wp:docPr id="1" name="Imagen 1"/>
+            <wp:cNvGraphicFramePr>
+              <a:graphicFrameLocks xmlns:a="http://schemas.openxmlformats.org/drawingml/2006/main" noChangeAspect="1"/>
+            </wp:cNvGraphicFramePr>
+            <a:graphic xmlns:a="http://schemas.openxmlformats.org/drawingml/2006/main">
+              <a:graphicData uri="http://schemas.openxmlformats.org/drawingml/2006/picture">
+                <pic:pic xmlns:pic="http://schemas.openxmlformats.org/drawingml/2006/picture">
+                  <pic:nvPicPr>
+                    <pic:cNvPr id="1" name=""/>
+                    <pic:cNvPicPr/>
+                  </pic:nvPicPr>
+                  <pic:blipFill>
+                    <a:blip r:embed="rId8"/>
+                    <a:stretch>
+                      <a:fillRect/>
+                    </a:stretch>
+                  </pic:blipFill>
+                  <pic:spPr>
+                    <a:xfrm>
+                      <a:off x="0" y="0"/>
+                      <a:ext cx="6309360" cy="2880995"/>
+                    </a:xfrm>
+                    <a:prstGeom prst="rect">
+                      <a:avLst/>
+                    </a:prstGeom>
+                  </pic:spPr>
+                </pic:pic>
+              </a:graphicData>
+            </a:graphic>
+          </wp:inline>
+        </w:drawing>
+      </w:r>
+    </w:p>
+    <w:p>
+      <w:pPr>
+        <w:jc w:val="center"/>
+        <w:rPr>
+          <w:i/>
+          <w:sz w:val="18"/>
+        </w:rPr>
+      </w:pPr>
+      <w:proofErr w:type="spellStart"/>
+      <w:r>
+        <w:rPr>
+          <w:i/>
+          <w:sz w:val="18"/>
+        </w:rPr>
+        <w:t>Figura</w:t>
+      </w:r>
+      <w:proofErr w:type="spellEnd"/>
+      <w:r>
+        <w:rPr>
+          <w:i/>
+          <w:sz w:val="18"/>
+        </w:rPr>
+        <w:t xml:space="preserve"> 1. Evidencia de la prueba de uso de PBL-17 con una persona </w:t>
+      </w:r>
+      <w:proofErr w:type="spellStart"/>
+      <w:r>
+        <w:rPr>
+          <w:i/>
+          <w:sz w:val="18"/>
+        </w:rPr>
+        <w:t>ajena</w:t>
+      </w:r>
+      <w:proofErr w:type="spellEnd"/>
+      <w:r>
+        <w:rPr>
+          <w:i/>
+          <w:sz w:val="18"/>
+        </w:rPr>
+        <w:t xml:space="preserve"> al </w:t>
+      </w:r>
+      <w:proofErr w:type="spellStart"/>
+      <w:r>
+        <w:rPr>
+          <w:i/>
+          <w:sz w:val="18"/>
+        </w:rPr>
+        <w:t>desarrollo</w:t>
+      </w:r>
+      <w:proofErr w:type="spellEnd"/>
+      <w:r>
+        <w:rPr>
+          <w:i/>
+          <w:sz w:val="18"/>
+        </w:rPr>
+        <w:t>.</w:t>
+      </w:r>
+    </w:p>
+    <w:p>
+      <w:pPr>
+        <w:pStyle w:val="Ttulo2"/>
+      </w:pPr>
+      <w:proofErr w:type="spellStart"/>
+      <w:r>
+        <w:t>Validación</w:t>
+      </w:r>
+      <w:proofErr w:type="spellEnd"/>
+      <w:r>
+        <w:t xml:space="preserve"> de PBL 19</w:t>
+      </w:r>
+    </w:p>
+    <w:p>
+      <w:r>
+        <w:t>Una persona nueva debe seguir la documentación para instalar dependencias, ejecutar las pruebas y utilizar el sistema. Esta persona no debe depender de instrucciones adicionales del desarrollador.</w:t>
+      </w:r>
+    </w:p>
+    <w:tbl>
+      <w:tblPr>
+        <w:tblW w:w="0" w:type="auto"/>
+        <w:jc w:val="center"/>
+        <w:tblBorders>
+          <w:top w:val="single" w:sz="6" w:space="0" w:color="D9D9D9"/>
+          <w:left w:val="single" w:sz="6" w:space="0" w:color="D9D9D9"/>
+          <w:bottom w:val="single" w:sz="6" w:space="0" w:color="D9D9D9"/>
+          <w:right w:val="single" w:sz="6" w:space="0" w:color="D9D9D9"/>
+          <w:insideH w:val="single" w:sz="6" w:space="0" w:color="D9D9D9"/>
+          <w:insideV w:val="single" w:sz="6" w:space="0" w:color="D9D9D9"/>
+        </w:tblBorders>
+        <w:tblLayout w:type="fixed"/>
+        <w:tblLook w:val="04A0" w:firstRow="1" w:lastRow="0" w:firstColumn="1" w:lastColumn="0" w:noHBand="0" w:noVBand="1"/>
+      </w:tblPr>
+      <w:tblGrid>
+        <w:gridCol w:w="3168"/>
+        <w:gridCol w:w="5904"/>
+      </w:tblGrid>
+      <w:tr>
+        <w:trPr>
+          <w:jc w:val="center"/>
+        </w:trPr>
+        <w:tc>
+          <w:tcPr>
+            <w:tcW w:w="3168" w:type="dxa"/>
+            <w:shd w:val="clear" w:color="auto" w:fill="1F4E78"/>
+            <w:vAlign w:val="center"/>
+          </w:tcPr>
+          <w:p>
+            <w:r>
+              <w:rPr>
+                <w:b/>
+                <w:color w:val="FFFFFF"/>
+                <w:sz w:val="18"/>
+              </w:rPr>
+              <w:t>Dato</w:t>
+            </w:r>
+          </w:p>
+        </w:tc>
+        <w:tc>
+          <w:tcPr>
+            <w:tcW w:w="5904" w:type="dxa"/>
+            <w:shd w:val="clear" w:color="auto" w:fill="1F4E78"/>
+            <w:vAlign w:val="center"/>
+          </w:tcPr>
+          <w:p>
+            <w:r>
+              <w:rPr>
+                <w:b/>
+                <w:color w:val="FFFFFF"/>
+                <w:sz w:val="18"/>
+              </w:rPr>
+              <w:t>Información que debes completar</w:t>
+            </w:r>
+          </w:p>
+        </w:tc>
+      </w:tr>
+      <w:tr>
+        <w:trPr>
+          <w:jc w:val="center"/>
+        </w:trPr>
+        <w:tc>
+          <w:tcPr>
+            <w:tcW w:w="3168" w:type="dxa"/>
+            <w:vAlign w:val="center"/>
+          </w:tcPr>
+          <w:p>
+            <w:pPr>
+              <w:spacing w:after="40"/>
+            </w:pPr>
+            <w:r>
+              <w:rPr>
+                <w:sz w:val="18"/>
+              </w:rPr>
+              <w:t>Nombre del participante</w:t>
+            </w:r>
+          </w:p>
+        </w:tc>
+        <w:tc>
+          <w:tcPr>
+            <w:tcW w:w="5904" w:type="dxa"/>
+            <w:vAlign w:val="center"/>
+          </w:tcPr>
+          <w:p>
+            <w:pPr>
+              <w:spacing w:after="40"/>
+            </w:pPr>
+            <w:r>
+              <w:rPr>
+                <w:sz w:val="18"/>
+              </w:rPr>
+              <w:t>Raquel</w:t>
+            </w:r>
+          </w:p>
+        </w:tc>
+      </w:tr>
+      <w:tr>
+        <w:trPr>
+          <w:jc w:val="center"/>
+        </w:trPr>
+        <w:tc>
+          <w:tcPr>
+            <w:tcW w:w="3168" w:type="dxa"/>
+            <w:shd w:val="clear" w:color="auto" w:fill="EAF2F8"/>
+            <w:vAlign w:val="center"/>
+          </w:tcPr>
+          <w:p>
+            <w:pPr>
+              <w:spacing w:after="40"/>
+            </w:pPr>
+            <w:r>
+              <w:rPr>
+                <w:sz w:val="18"/>
+              </w:rPr>
+              <w:t>Fecha de la validación</w:t>
+            </w:r>
+          </w:p>
+        </w:tc>
+        <w:tc>
+          <w:tcPr>
+            <w:tcW w:w="5904" w:type="dxa"/>
+            <w:shd w:val="clear" w:color="auto" w:fill="EAF2F8"/>
+            <w:vAlign w:val="center"/>
+          </w:tcPr>
+          <w:p>
+            <w:pPr>
+              <w:spacing w:after="40"/>
+            </w:pPr>
+            <w:r>
+              <w:rPr>
+                <w:sz w:val="18"/>
+              </w:rPr>
+              <w:t>07/10/2026</w:t>
+            </w:r>
+          </w:p>
+        </w:tc>
+      </w:tr>
+      <w:tr>
+        <w:trPr>
+          <w:jc w:val="center"/>
+        </w:trPr>
+        <w:tc>
+          <w:tcPr>
+            <w:tcW w:w="3168" w:type="dxa"/>
+            <w:vAlign w:val="center"/>
+          </w:tcPr>
+          <w:p>
+            <w:pPr>
+              <w:spacing w:after="40"/>
+            </w:pPr>
+            <w:r>
+              <w:rPr>
+                <w:sz w:val="18"/>
+              </w:rPr>
+              <w:t>Instalación</w:t>
+            </w:r>
+          </w:p>
+        </w:tc>
+        <w:tc>
+          <w:tcPr>
+            <w:tcW w:w="5904" w:type="dxa"/>
+            <w:vAlign w:val="center"/>
+          </w:tcPr>
+          <w:p>
+            <w:pPr>
+              <w:spacing w:after="40"/>
+            </w:pPr>
+            <w:proofErr w:type="spellStart"/>
+            <w:r>
+              <w:rPr>
+                <w:sz w:val="18"/>
+              </w:rPr>
+              <w:t>Completada</w:t>
+            </w:r>
+            <w:proofErr w:type="spellEnd"/>
+            <w:r>
+              <w:rPr>
+                <w:sz w:val="18"/>
+              </w:rPr>
+              <w:t xml:space="preserve">     </w:t>
+            </w:r>
+          </w:p>
+        </w:tc>
+      </w:tr>
+      <w:tr>
+        <w:trPr>
+          <w:jc w:val="center"/>
+        </w:trPr>
+        <w:tc>
+          <w:tcPr>
+            <w:tcW w:w="3168" w:type="dxa"/>
+            <w:shd w:val="clear" w:color="auto" w:fill="EAF2F8"/>
+            <w:vAlign w:val="center"/>
+          </w:tcPr>
+          <w:p>
+            <w:pPr>
+              <w:spacing w:after="40"/>
+            </w:pPr>
+            <w:r>
+              <w:rPr>
+                <w:sz w:val="18"/>
+              </w:rPr>
+              <w:t>Pruebas</w:t>
+            </w:r>
+          </w:p>
+        </w:tc>
+        <w:tc>
+          <w:tcPr>
+            <w:tcW w:w="5904" w:type="dxa"/>
+            <w:shd w:val="clear" w:color="auto" w:fill="EAF2F8"/>
+            <w:vAlign w:val="center"/>
+          </w:tcPr>
+          <w:p>
+            <w:pPr>
+              <w:spacing w:after="40"/>
+            </w:pPr>
+            <w:r>
+              <w:rPr>
+                <w:sz w:val="18"/>
+              </w:rPr>
+              <w:t xml:space="preserve"> Aprobadas     </w:t>
+            </w:r>
+          </w:p>
+        </w:tc>
+      </w:tr>
+      <w:tr>
+        <w:trPr>
+          <w:jc w:val="center"/>
+        </w:trPr>
+        <w:tc>
+          <w:tcPr>
+            <w:tcW w:w="3168" w:type="dxa"/>
+            <w:vAlign w:val="center"/>
+          </w:tcPr>
+          <w:p>
+            <w:pPr>
+              <w:spacing w:after="40"/>
+            </w:pPr>
+            <w:r>
+              <w:rPr>
+                <w:sz w:val="18"/>
+              </w:rPr>
+              <w:t>Uso del sistema</w:t>
+            </w:r>
+          </w:p>
+        </w:tc>
+        <w:tc>
+          <w:tcPr>
+            <w:tcW w:w="5904" w:type="dxa"/>
+            <w:vAlign w:val="center"/>
+          </w:tcPr>
+          <w:p>
+            <w:pPr>
+              <w:spacing w:after="40"/>
+            </w:pPr>
+            <w:proofErr w:type="spellStart"/>
+            <w:r>
+              <w:rPr>
+                <w:sz w:val="18"/>
+              </w:rPr>
+              <w:t>Completado</w:t>
+            </w:r>
+            <w:proofErr w:type="spellEnd"/>
+            <w:r>
+              <w:rPr>
+                <w:sz w:val="18"/>
+              </w:rPr>
+              <w:t xml:space="preserve"> </w:t>
+            </w:r>
+          </w:p>
+        </w:tc>
+      </w:tr>
+      <w:tr>
+        <w:trPr>
+          <w:jc w:val="center"/>
+        </w:trPr>
+        <w:tc>
+          <w:tcPr>
+            <w:tcW w:w="3168" w:type="dxa"/>
+            <w:shd w:val="clear" w:color="auto" w:fill="EAF2F8"/>
+            <w:vAlign w:val="center"/>
+          </w:tcPr>
+          <w:p>
+            <w:pPr>
+              <w:spacing w:after="40"/>
+            </w:pPr>
+            <w:r>
+              <w:rPr>
+                <w:sz w:val="18"/>
+              </w:rPr>
+              <w:t>Problemas encontrados</w:t>
+            </w:r>
+          </w:p>
+        </w:tc>
+        <w:tc>
+          <w:tcPr>
+            <w:tcW w:w="5904" w:type="dxa"/>
+            <w:shd w:val="clear" w:color="auto" w:fill="EAF2F8"/>
+            <w:vAlign w:val="center"/>
+          </w:tcPr>
+          <w:p>
+            <w:pPr>
+              <w:spacing w:after="40"/>
+            </w:pPr>
+            <w:proofErr w:type="spellStart"/>
+            <w:r>
+              <w:rPr>
+                <w:sz w:val="18"/>
+              </w:rPr>
+              <w:t>Ninguno</w:t>
+            </w:r>
+            <w:proofErr w:type="spellEnd"/>
+          </w:p>
+        </w:tc>
+      </w:tr>
+      <w:tr>
+        <w:trPr>
+          <w:jc w:val="center"/>
+        </w:trPr>
+        <w:tc>
+          <w:tcPr>
+            <w:tcW w:w="3168" w:type="dxa"/>
+            <w:vAlign w:val="center"/>
+          </w:tcPr>
+          <w:p>
+            <w:pPr>
+              <w:spacing w:after="40"/>
+            </w:pPr>
+            <w:r>
+              <w:rPr>
+                <w:sz w:val="18"/>
+              </w:rPr>
+              <w:t>Resultado final</w:t>
+            </w:r>
+          </w:p>
+        </w:tc>
+        <w:tc>
+          <w:tcPr>
+            <w:tcW w:w="5904" w:type="dxa"/>
+            <w:vAlign w:val="center"/>
+          </w:tcPr>
+          <w:p>
+            <w:pPr>
+              <w:spacing w:after="40"/>
+            </w:pPr>
+            <w:r>
+              <w:rPr>
+                <w:sz w:val="18"/>
+              </w:rPr>
+              <w:t xml:space="preserve">Todo </w:t>
+            </w:r>
+            <w:proofErr w:type="spellStart"/>
+            <w:r>
+              <w:rPr>
+                <w:sz w:val="18"/>
+              </w:rPr>
+              <w:t>Correcto</w:t>
+            </w:r>
+            <w:proofErr w:type="spellEnd"/>
+          </w:p>
+        </w:tc>
+      </w:tr>
+    </w:tbl>
+    <w:p/>
+    <w:p>
+      <w:pPr>
+        <w:jc w:val="center"/>
+        <w:rPr>
+          <w:i/>
+          <w:sz w:val="18"/>
+        </w:rPr>
+      </w:pPr>
+      <w:r>
+        <w:rPr>
+          <w:i/>
+          <w:sz w:val="18"/>
+        </w:rPr>
+        <w:lastRenderedPageBreak/>
+        <w:drawing>
+          <wp:inline distT="0" distB="0" distL="0" distR="0" wp14:anchorId="3FE3DCBC" wp14:editId="6E5C1E72">
+            <wp:extent cx="6309360" cy="1916430"/>
+            <wp:effectExtent l="0" t="0" r="0" b="7620"/>
+            <wp:docPr id="2" name="Imagen 2"/>
+            <wp:cNvGraphicFramePr>
+              <a:graphicFrameLocks xmlns:a="http://schemas.openxmlformats.org/drawingml/2006/main" noChangeAspect="1"/>
+            </wp:cNvGraphicFramePr>
+            <a:graphic xmlns:a="http://schemas.openxmlformats.org/drawingml/2006/main">
+              <a:graphicData uri="http://schemas.openxmlformats.org/drawingml/2006/picture">
+                <pic:pic xmlns:pic="http://schemas.openxmlformats.org/drawingml/2006/picture">
+                  <pic:nvPicPr>
+                    <pic:cNvPr id="1" name=""/>
+                    <pic:cNvPicPr/>
+                  </pic:nvPicPr>
+                  <pic:blipFill>
+                    <a:blip r:embed="rId9"/>
+                    <a:stretch>
+                      <a:fillRect/>
+                    </a:stretch>
+                  </pic:blipFill>
+                  <pic:spPr>
+                    <a:xfrm>
+                      <a:off x="0" y="0"/>
+                      <a:ext cx="6309360" cy="1916430"/>
+                    </a:xfrm>
+                    <a:prstGeom prst="rect">
+                      <a:avLst/>
+                    </a:prstGeom>
+                  </pic:spPr>
+                </pic:pic>
+              </a:graphicData>
+            </a:graphic>
+          </wp:inline>
+        </w:drawing>
+      </w:r>
+    </w:p>
+    <w:p>
+      <w:pPr>
+        <w:jc w:val="center"/>
+      </w:pPr>
+      <w:proofErr w:type="spellStart"/>
+      <w:r>
+        <w:rPr>
+          <w:i/>
+          <w:sz w:val="18"/>
+        </w:rPr>
+        <w:t>Figura</w:t>
+      </w:r>
+      <w:proofErr w:type="spellEnd"/>
+      <w:r>
+        <w:rPr>
+          <w:i/>
+          <w:sz w:val="18"/>
+        </w:rPr>
+        <w:t xml:space="preserve"> 2. Evidencia de la validación de PBL-19 realizada por una persona nueva.</w:t>
+      </w:r>
+    </w:p>
+    <w:p>
+      <w:pPr>
+        <w:pStyle w:val="Listaconvietas"/>
+        <w:numPr>
+          <w:ilvl w:val="0"/>
+          <w:numId w:val="0"/>
+        </w:numPr>
+      </w:pPr>
+    </w:p>
     <w:sectPr>
-      <w:footerReference w:type="default" r:id="rId8"/>
+      <w:footerReference w:type="default" r:id="rId10"/>
       <w:pgSz w:w="12240" w:h="15840"/>
       <w:pgMar w:top="1080" w:right="1152" w:bottom="1080" w:left="1152" w:header="720" w:footer="720" w:gutter="0"/>
       <w:cols w:space="720"/>

</xml_diff>